<commit_message>
docs: rebuild project report as v1.0 with future enhancements
- Reframed as v1.0 (first complete public release)
- All 10 roadmap phases marked Completed, phase numbers/target
  versions removed
- File structure table rebuilt for v3 flat layout (48 files)
- Tech stack table expanded to 14 entries (added Office, Messaging,
  Search, Voice Output, Auth, Testing rows)
- New section 8: Future Enhancements with 5 detailed plans:
  1. Persistent Vector Memory / RAG (ChromaDB + Ollama embed)
  2. Multi-modal Image Input (LLaVA/Moondream via Ollama)
  3. Git/GitHub Integration (gitpython + PR creation)
  4. Automated Test Runner (pytest sandbox + Ralph Loop feedback)
  5. Agent Plugin System (manifest-based extensible tool calling)
</commit_message>
<xml_diff>
--- a/KreativOS_Project_Report.docx
+++ b/KreativOS_Project_Report.docx
@@ -36,7 +36,7 @@
           <w:color w:val="8C8CA0"/>
           <w:sz w:val="22"/>
         </w:rPr>
-        <w:t>Version 3.0  ·  June 2026</w:t>
+        <w:t>Pre-release Prototypes  ·  June 2026</w:t>
       </w:r>
     </w:p>
     <w:p/>
@@ -469,7 +469,7 @@
           <w:color w:val="4F3FA0"/>
           <w:sz w:val="48"/>
         </w:rPr>
-        <w:t>3. Achievements (v1 → v2 → v3)</w:t>
+        <w:t>3. Achievements (Milestones to v1.0)</w:t>
       </w:r>
     </w:p>
     <w:p>
@@ -483,7 +483,7 @@
           <w:color w:val="3C3C50"/>
           <w:sz w:val="36"/>
         </w:rPr>
-        <w:t>Version 1.0</w:t>
+        <w:t>Pre-release Prototypes</w:t>
       </w:r>
     </w:p>
     <w:p>
@@ -614,7 +614,7 @@
           <w:color w:val="3C3C50"/>
           <w:sz w:val="36"/>
         </w:rPr>
-        <w:t>Version 2.0</w:t>
+        <w:t>Beta Testing</w:t>
       </w:r>
     </w:p>
     <w:p>
@@ -719,7 +719,7 @@
           <w:color w:val="3C3C50"/>
           <w:sz w:val="36"/>
         </w:rPr>
-        <w:t>Version 3.0 (current)</w:t>
+        <w:t>Pre-release Prototypes (Current Release)</w:t>
       </w:r>
     </w:p>
     <w:p>
@@ -798,153 +798,6 @@
           <w:sz w:val="21"/>
         </w:rPr>
         <w:t>CPU guidance — file size and RAM warnings for Oracle VM users</w:t>
-      </w:r>
-    </w:p>
-    <w:p>
-      <w:pPr>
-        <w:pStyle w:val="Normal"/>
-      </w:pPr>
-      <w:r>
-        <w:rPr>
-          <w:b/>
-        </w:rPr>
-        <w:t>Version 3.0</w:t>
-      </w:r>
-    </w:p>
-    <w:p>
-      <w:pPr>
-        <w:pStyle w:val="List Bullet"/>
-      </w:pPr>
-      <w:r>
-        <w:t xml:space="preserve">All 10 enhancement phases shipped in a single unified codebase</w:t>
-      </w:r>
-    </w:p>
-    <w:p>
-      <w:pPr>
-        <w:pStyle w:val="List Bullet"/>
-      </w:pPr>
-      <w:r>
-        <w:t xml:space="preserve">Multi-Agent Pipeline - Orchestrator auto-routes tasks across Architect &gt; Coder &gt; DevOps agents</w:t>
-      </w:r>
-    </w:p>
-    <w:p>
-      <w:pPr>
-        <w:pStyle w:val="List Bullet"/>
-      </w:pPr>
-      <w:r>
-        <w:t xml:space="preserve">Project Memory - persistent context file per project; agents read memory before responding</w:t>
-      </w:r>
-    </w:p>
-    <w:p>
-      <w:pPr>
-        <w:pStyle w:val="List Bullet"/>
-      </w:pPr>
-      <w:r>
-        <w:t xml:space="preserve">Web Search - Researcher agent uses DuckDuckGo live search; results injected into context</w:t>
-      </w:r>
-    </w:p>
-    <w:p>
-      <w:pPr>
-        <w:pStyle w:val="List Bullet"/>
-      </w:pPr>
-      <w:r>
-        <w:t xml:space="preserve">App Builder - Coder generates full multi-file apps with preview panel and zip download</w:t>
-      </w:r>
-    </w:p>
-    <w:p>
-      <w:pPr>
-        <w:pStyle w:val="List Bullet"/>
-      </w:pPr>
-      <w:r>
-        <w:t xml:space="preserve">Visual Canvas - drag-and-drop node editor for custom multi-agent workflows</w:t>
-      </w:r>
-    </w:p>
-    <w:p>
-      <w:pPr>
-        <w:pStyle w:val="List Bullet"/>
-      </w:pPr>
-      <w:r>
-        <w:t xml:space="preserve">Voice Output - browser TTS speaks agent responses; full voice conversation mode</w:t>
-      </w:r>
-    </w:p>
-    <w:p>
-      <w:pPr>
-        <w:pStyle w:val="List Bullet"/>
-      </w:pPr>
-      <w:r>
-        <w:t xml:space="preserve">Code Review Agent - upload any file, get structured bug/security/style report with auto-fix</w:t>
-      </w:r>
-    </w:p>
-    <w:p>
-      <w:pPr>
-        <w:pStyle w:val="List Bullet"/>
-      </w:pPr>
-      <w:r>
-        <w:t xml:space="preserve">Scheduled Tasks - cron-style task scheduler with Dashboard visibility and output logs</w:t>
-      </w:r>
-    </w:p>
-    <w:p>
-      <w:pPr>
-        <w:pStyle w:val="List Bullet"/>
-      </w:pPr>
-      <w:r>
-        <w:t xml:space="preserve">Multi-User Auth - login page, per-user workspaces, admin panel</w:t>
-      </w:r>
-    </w:p>
-    <w:p>
-      <w:pPr>
-        <w:pStyle w:val="List Bullet"/>
-      </w:pPr>
-      <w:r>
-        <w:t xml:space="preserve">PWA - installable on mobile, offline chat history, push notifications, mobile-optimised layout</w:t>
-      </w:r>
-    </w:p>
-    <w:p>
-      <w:pPr>
-        <w:pStyle w:val="List Bullet"/>
-      </w:pPr>
-      <w:r>
-        <w:t xml:space="preserve">Telegram Bot - control KreativOS from Telegram: run tasks, get results, check status</w:t>
-      </w:r>
-    </w:p>
-    <w:p>
-      <w:pPr>
-        <w:pStyle w:val="List Bullet"/>
-      </w:pPr>
-      <w:r>
-        <w:t xml:space="preserve">Office Suite - generate .docx, .xlsx, .pptx files directly from agent output</w:t>
-      </w:r>
-    </w:p>
-    <w:p>
-      <w:pPr>
-        <w:pStyle w:val="List Bullet"/>
-      </w:pPr>
-      <w:r>
-        <w:t xml:space="preserve">Audit Log - timestamped log of every agent action with full context</w:t>
-      </w:r>
-    </w:p>
-    <w:p>
-      <w:pPr>
-        <w:pStyle w:val="List Bullet"/>
-      </w:pPr>
-      <w:r>
-        <w:t xml:space="preserve">Pipeline View - real-time multi-agent task pipeline with stage-by-stage progress tracker</w:t>
-      </w:r>
-    </w:p>
-    <w:p>
-      <w:pPr>
-        <w:pStyle w:val="List Bullet"/>
-      </w:pPr>
-      <w:r>
-        <w:t xml:space="preserve">Scheduler View - visual cron manager with next-run countdown and task history</w:t>
-      </w:r>
-    </w:p>
-    <w:p>
-      <w:pPr>
-        <w:pStyle w:val="List Bullet"/>
-      </w:pPr>
-      <w:r>
-        <w:t xml:space="preserve">Skill Evaluator - benchmark agent quality across domain-specific test prompts</w:t>
       </w:r>
     </w:p>
     <w:p>
@@ -1033,12 +886,12 @@
       <w:tr>
         <w:tc>
           <w:tcPr>
-            <w:tcW w:type="dxa" w:w="1984"/>
+            <w:tcW w:type="dxa" w:w="3135"/>
           </w:tcPr>
           <w:p>
             <w:r>
               <w:rPr>
-                <w:sz w:val="20"/>
+                <w:b/>
               </w:rPr>
               <w:t>AI Engine</w:t>
             </w:r>
@@ -1046,27 +899,21 @@
         </w:tc>
         <w:tc>
           <w:tcPr>
-            <w:tcW w:type="dxa" w:w="2551"/>
+            <w:tcW w:type="dxa" w:w="3135"/>
           </w:tcPr>
           <w:p>
             <w:r>
-              <w:rPr>
-                <w:sz w:val="20"/>
-              </w:rPr>
               <w:t>Ollama</w:t>
             </w:r>
           </w:p>
         </w:tc>
         <w:tc>
           <w:tcPr>
-            <w:tcW w:type="dxa" w:w="5102"/>
+            <w:tcW w:type="dxa" w:w="3135"/>
           </w:tcPr>
           <w:p>
             <w:r>
-              <w:rPr>
-                <w:sz w:val="20"/>
-              </w:rPr>
-              <w:t>Runs local GGUF models, no cloud needed</w:t>
+              <w:t>Local GGUF models, no cloud, no API key</w:t>
             </w:r>
           </w:p>
         </w:tc>
@@ -1074,13 +921,12 @@
       <w:tr>
         <w:tc>
           <w:tcPr>
-            <w:tcW w:type="dxa" w:w="1984"/>
-            <w:shd w:fill="F4F3FD" w:val="clear"/>
+            <w:tcW w:type="dxa" w:w="3135"/>
           </w:tcPr>
           <w:p>
             <w:r>
               <w:rPr>
-                <w:sz w:val="20"/>
+                <w:b/>
               </w:rPr>
               <w:t>Models</w:t>
             </w:r>
@@ -1088,29 +934,21 @@
         </w:tc>
         <w:tc>
           <w:tcPr>
-            <w:tcW w:type="dxa" w:w="2551"/>
-            <w:shd w:fill="F4F3FD" w:val="clear"/>
+            <w:tcW w:type="dxa" w:w="3135"/>
           </w:tcPr>
           <w:p>
             <w:r>
-              <w:rPr>
-                <w:sz w:val="20"/>
-              </w:rPr>
-              <w:t>Qwen3 27B + any GGUF</w:t>
+              <w:t>Any GGUF via Model Hub</w:t>
             </w:r>
           </w:p>
         </w:tc>
         <w:tc>
           <w:tcPr>
-            <w:tcW w:type="dxa" w:w="5102"/>
-            <w:shd w:fill="F4F3FD" w:val="clear"/>
+            <w:tcW w:type="dxa" w:w="3135"/>
           </w:tcPr>
           <w:p>
             <w:r>
-              <w:rPr>
-                <w:sz w:val="20"/>
-              </w:rPr>
-              <w:t>Main reasoning model + Model Hub downloads</w:t>
+              <w:t>Downloaded from HuggingFace inside the app</w:t>
             </w:r>
           </w:p>
         </w:tc>
@@ -1118,12 +956,12 @@
       <w:tr>
         <w:tc>
           <w:tcPr>
-            <w:tcW w:type="dxa" w:w="1984"/>
+            <w:tcW w:type="dxa" w:w="3135"/>
           </w:tcPr>
           <w:p>
             <w:r>
               <w:rPr>
-                <w:sz w:val="20"/>
+                <w:b/>
               </w:rPr>
               <w:t>Backend</w:t>
             </w:r>
@@ -1131,27 +969,21 @@
         </w:tc>
         <w:tc>
           <w:tcPr>
-            <w:tcW w:type="dxa" w:w="2551"/>
+            <w:tcW w:type="dxa" w:w="3135"/>
           </w:tcPr>
           <w:p>
             <w:r>
-              <w:rPr>
-                <w:sz w:val="20"/>
-              </w:rPr>
-              <w:t>Python FastAPI</w:t>
+              <w:t>Python FastAPI + Uvicorn</w:t>
             </w:r>
           </w:p>
         </w:tc>
         <w:tc>
           <w:tcPr>
-            <w:tcW w:type="dxa" w:w="5102"/>
+            <w:tcW w:type="dxa" w:w="3135"/>
           </w:tcPr>
           <w:p>
             <w:r>
-              <w:rPr>
-                <w:sz w:val="20"/>
-              </w:rPr>
-              <w:t>API, streaming, agents, Ralph Loop, file ops</w:t>
+              <w:t>API, SSE streaming, all 10 feature modules</w:t>
             </w:r>
           </w:p>
         </w:tc>
@@ -1159,13 +991,12 @@
       <w:tr>
         <w:tc>
           <w:tcPr>
-            <w:tcW w:type="dxa" w:w="1984"/>
-            <w:shd w:fill="F4F3FD" w:val="clear"/>
+            <w:tcW w:type="dxa" w:w="3135"/>
           </w:tcPr>
           <w:p>
             <w:r>
               <w:rPr>
-                <w:sz w:val="20"/>
+                <w:b/>
               </w:rPr>
               <w:t>Frontend</w:t>
             </w:r>
@@ -1173,29 +1004,21 @@
         </w:tc>
         <w:tc>
           <w:tcPr>
-            <w:tcW w:type="dxa" w:w="2551"/>
-            <w:shd w:fill="F4F3FD" w:val="clear"/>
+            <w:tcW w:type="dxa" w:w="3135"/>
           </w:tcPr>
           <w:p>
             <w:r>
-              <w:rPr>
-                <w:sz w:val="20"/>
-              </w:rPr>
-              <w:t>React 18 + Tailwind CSS</w:t>
+              <w:t>React 18 + Vite + Tailwind CSS</w:t>
             </w:r>
           </w:p>
         </w:tc>
         <w:tc>
           <w:tcPr>
-            <w:tcW w:type="dxa" w:w="5102"/>
-            <w:shd w:fill="F4F3FD" w:val="clear"/>
+            <w:tcW w:type="dxa" w:w="3135"/>
           </w:tcPr>
           <w:p>
             <w:r>
-              <w:rPr>
-                <w:sz w:val="20"/>
-              </w:rPr>
-              <w:t>Browser UI, chat, dashboard, file manager</w:t>
+              <w:t>Browser UI, 20 views, dark terminal theme</w:t>
             </w:r>
           </w:p>
         </w:tc>
@@ -1203,12 +1026,12 @@
       <w:tr>
         <w:tc>
           <w:tcPr>
-            <w:tcW w:type="dxa" w:w="1984"/>
+            <w:tcW w:type="dxa" w:w="3135"/>
           </w:tcPr>
           <w:p>
             <w:r>
               <w:rPr>
-                <w:sz w:val="20"/>
+                <w:b/>
               </w:rPr>
               <w:t>State</w:t>
             </w:r>
@@ -1216,27 +1039,21 @@
         </w:tc>
         <w:tc>
           <w:tcPr>
-            <w:tcW w:type="dxa" w:w="2551"/>
+            <w:tcW w:type="dxa" w:w="3135"/>
           </w:tcPr>
           <w:p>
             <w:r>
-              <w:rPr>
-                <w:sz w:val="20"/>
-              </w:rPr>
               <w:t>Zustand</w:t>
             </w:r>
           </w:p>
         </w:tc>
         <w:tc>
           <w:tcPr>
-            <w:tcW w:type="dxa" w:w="5102"/>
+            <w:tcW w:type="dxa" w:w="3135"/>
           </w:tcPr>
           <w:p>
             <w:r>
-              <w:rPr>
-                <w:sz w:val="20"/>
-              </w:rPr>
-              <w:t>Global state, chat history (localStorage)</w:t>
+              <w:t>Global state, chat history in localStorage</w:t>
             </w:r>
           </w:p>
         </w:tc>
@@ -1244,13 +1061,152 @@
       <w:tr>
         <w:tc>
           <w:tcPr>
-            <w:tcW w:type="dxa" w:w="1984"/>
-            <w:shd w:fill="F4F3FD" w:val="clear"/>
+            <w:tcW w:type="dxa" w:w="3135"/>
           </w:tcPr>
           <w:p>
             <w:r>
               <w:rPr>
-                <w:sz w:val="20"/>
+                <w:b/>
+              </w:rPr>
+              <w:t>Markdown</w:t>
+            </w:r>
+          </w:p>
+        </w:tc>
+        <w:tc>
+          <w:tcPr>
+            <w:tcW w:type="dxa" w:w="3135"/>
+          </w:tcPr>
+          <w:p>
+            <w:r>
+              <w:t>react-markdown + remark-gfm</w:t>
+            </w:r>
+          </w:p>
+        </w:tc>
+        <w:tc>
+          <w:tcPr>
+            <w:tcW w:type="dxa" w:w="3135"/>
+          </w:tcPr>
+          <w:p>
+            <w:r>
+              <w:t>Rich markdown, tables, syntax highlighting</w:t>
+            </w:r>
+          </w:p>
+        </w:tc>
+      </w:tr>
+      <w:tr>
+        <w:tc>
+          <w:tcPr>
+            <w:tcW w:type="dxa" w:w="3135"/>
+          </w:tcPr>
+          <w:p>
+            <w:r>
+              <w:rPr>
+                <w:b/>
+              </w:rPr>
+              <w:t>Office</w:t>
+            </w:r>
+          </w:p>
+        </w:tc>
+        <w:tc>
+          <w:tcPr>
+            <w:tcW w:type="dxa" w:w="3135"/>
+          </w:tcPr>
+          <w:p>
+            <w:r>
+              <w:t>python-pptx / python-docx / openpyxl</w:t>
+            </w:r>
+          </w:p>
+        </w:tc>
+        <w:tc>
+          <w:tcPr>
+            <w:tcW w:type="dxa" w:w="3135"/>
+          </w:tcPr>
+          <w:p>
+            <w:r>
+              <w:t>Generate Word, Excel, PowerPoint files</w:t>
+            </w:r>
+          </w:p>
+        </w:tc>
+      </w:tr>
+      <w:tr>
+        <w:tc>
+          <w:tcPr>
+            <w:tcW w:type="dxa" w:w="3135"/>
+          </w:tcPr>
+          <w:p>
+            <w:r>
+              <w:rPr>
+                <w:b/>
+              </w:rPr>
+              <w:t>Messaging</w:t>
+            </w:r>
+          </w:p>
+        </w:tc>
+        <w:tc>
+          <w:tcPr>
+            <w:tcW w:type="dxa" w:w="3135"/>
+          </w:tcPr>
+          <w:p>
+            <w:r>
+              <w:t>python-telegram-bot</w:t>
+            </w:r>
+          </w:p>
+        </w:tc>
+        <w:tc>
+          <w:tcPr>
+            <w:tcW w:type="dxa" w:w="3135"/>
+          </w:tcPr>
+          <w:p>
+            <w:r>
+              <w:t>Telegram bot integration</w:t>
+            </w:r>
+          </w:p>
+        </w:tc>
+      </w:tr>
+      <w:tr>
+        <w:tc>
+          <w:tcPr>
+            <w:tcW w:type="dxa" w:w="3135"/>
+          </w:tcPr>
+          <w:p>
+            <w:r>
+              <w:rPr>
+                <w:b/>
+              </w:rPr>
+              <w:t>Search</w:t>
+            </w:r>
+          </w:p>
+        </w:tc>
+        <w:tc>
+          <w:tcPr>
+            <w:tcW w:type="dxa" w:w="3135"/>
+          </w:tcPr>
+          <w:p>
+            <w:r>
+              <w:t>DuckDuckGo (free, no key)</w:t>
+            </w:r>
+          </w:p>
+        </w:tc>
+        <w:tc>
+          <w:tcPr>
+            <w:tcW w:type="dxa" w:w="3135"/>
+          </w:tcPr>
+          <w:p>
+            <w:r>
+              <w:t>Live web search for Researcher agent</w:t>
+            </w:r>
+          </w:p>
+        </w:tc>
+      </w:tr>
+      <w:tr>
+        <w:tc>
+          <w:tcPr>
+            <w:tcW w:type="dxa" w:w="3135"/>
+          </w:tcPr>
+          <w:p>
+            <w:r>
+              <w:rPr>
+                <w:b/>
               </w:rPr>
               <w:t>Deployment</w:t>
             </w:r>
@@ -1258,28 +1214,20 @@
         </w:tc>
         <w:tc>
           <w:tcPr>
-            <w:tcW w:type="dxa" w:w="2551"/>
-            <w:shd w:fill="F4F3FD" w:val="clear"/>
+            <w:tcW w:type="dxa" w:w="3135"/>
           </w:tcPr>
           <w:p>
             <w:r>
-              <w:rPr>
-                <w:sz w:val="20"/>
-              </w:rPr>
               <w:t>Docker + docker-compose</w:t>
             </w:r>
           </w:p>
         </w:tc>
         <w:tc>
           <w:tcPr>
-            <w:tcW w:type="dxa" w:w="5102"/>
-            <w:shd w:fill="F4F3FD" w:val="clear"/>
+            <w:tcW w:type="dxa" w:w="3135"/>
           </w:tcPr>
           <w:p>
             <w:r>
-              <w:rPr>
-                <w:sz w:val="20"/>
-              </w:rPr>
               <w:t>One-command deploy on any Ubuntu server</w:t>
             </w:r>
           </w:p>
@@ -1288,39 +1236,33 @@
       <w:tr>
         <w:tc>
           <w:tcPr>
-            <w:tcW w:type="dxa" w:w="1984"/>
+            <w:tcW w:type="dxa" w:w="3135"/>
           </w:tcPr>
           <w:p>
             <w:r>
               <w:rPr>
-                <w:sz w:val="20"/>
+                <w:b/>
               </w:rPr>
-              <w:t>Voice</w:t>
+              <w:t>Voice Input</w:t>
             </w:r>
           </w:p>
         </w:tc>
         <w:tc>
           <w:tcPr>
-            <w:tcW w:type="dxa" w:w="2551"/>
+            <w:tcW w:type="dxa" w:w="3135"/>
           </w:tcPr>
           <w:p>
             <w:r>
-              <w:rPr>
-                <w:sz w:val="20"/>
-              </w:rPr>
               <w:t>Web Speech API</w:t>
             </w:r>
           </w:p>
         </w:tc>
         <w:tc>
           <w:tcPr>
-            <w:tcW w:type="dxa" w:w="5102"/>
+            <w:tcW w:type="dxa" w:w="3135"/>
           </w:tcPr>
           <w:p>
             <w:r>
-              <w:rPr>
-                <w:sz w:val="20"/>
-              </w:rPr>
               <w:t>Browser-native, no API key, Chrome/Edge</w:t>
             </w:r>
           </w:p>
@@ -1329,43 +1271,104 @@
       <w:tr>
         <w:tc>
           <w:tcPr>
-            <w:tcW w:type="dxa" w:w="1984"/>
-            <w:shd w:fill="F4F3FD" w:val="clear"/>
+            <w:tcW w:type="dxa" w:w="3135"/>
           </w:tcPr>
           <w:p>
             <w:r>
               <w:rPr>
-                <w:sz w:val="20"/>
+                <w:b/>
               </w:rPr>
-              <w:t>Model Source</w:t>
+              <w:t>Voice Output</w:t>
             </w:r>
           </w:p>
         </w:tc>
         <w:tc>
           <w:tcPr>
-            <w:tcW w:type="dxa" w:w="2551"/>
-            <w:shd w:fill="F4F3FD" w:val="clear"/>
+            <w:tcW w:type="dxa" w:w="3135"/>
           </w:tcPr>
           <w:p>
             <w:r>
-              <w:rPr>
-                <w:sz w:val="20"/>
-              </w:rPr>
-              <w:t>HuggingFace (GGUF)</w:t>
+              <w:t>Web Speech Synthesis API</w:t>
             </w:r>
           </w:p>
         </w:tc>
         <w:tc>
           <w:tcPr>
-            <w:tcW w:type="dxa" w:w="5102"/>
-            <w:shd w:fill="F4F3FD" w:val="clear"/>
+            <w:tcW w:type="dxa" w:w="3135"/>
+          </w:tcPr>
+          <w:p>
+            <w:r>
+              <w:t>Browser-native TTS, no API key</w:t>
+            </w:r>
+          </w:p>
+        </w:tc>
+      </w:tr>
+      <w:tr>
+        <w:tc>
+          <w:tcPr>
+            <w:tcW w:type="dxa" w:w="3135"/>
           </w:tcPr>
           <w:p>
             <w:r>
               <w:rPr>
-                <w:sz w:val="20"/>
+                <w:b/>
               </w:rPr>
-              <w:t>Free model library, CPU-optimised files</w:t>
+              <w:t>Auth</w:t>
+            </w:r>
+          </w:p>
+        </w:tc>
+        <w:tc>
+          <w:tcPr>
+            <w:tcW w:type="dxa" w:w="3135"/>
+          </w:tcPr>
+          <w:p>
+            <w:r>
+              <w:t>bcrypt + JWT (local)</w:t>
+            </w:r>
+          </w:p>
+        </w:tc>
+        <w:tc>
+          <w:tcPr>
+            <w:tcW w:type="dxa" w:w="3135"/>
+          </w:tcPr>
+          <w:p>
+            <w:r>
+              <w:t>No external auth service needed</w:t>
+            </w:r>
+          </w:p>
+        </w:tc>
+      </w:tr>
+      <w:tr>
+        <w:tc>
+          <w:tcPr>
+            <w:tcW w:type="dxa" w:w="3135"/>
+          </w:tcPr>
+          <w:p>
+            <w:r>
+              <w:rPr>
+                <w:b/>
+              </w:rPr>
+              <w:t>Testing</w:t>
+            </w:r>
+          </w:p>
+        </w:tc>
+        <w:tc>
+          <w:tcPr>
+            <w:tcW w:type="dxa" w:w="3135"/>
+          </w:tcPr>
+          <w:p>
+            <w:r>
+              <w:t>pytest + pytest-asyncio + httpx</w:t>
+            </w:r>
+          </w:p>
+        </w:tc>
+        <w:tc>
+          <w:tcPr>
+            <w:tcW w:type="dxa" w:w="3135"/>
+          </w:tcPr>
+          <w:p>
+            <w:r>
+              <w:t>Full async test suite</w:t>
             </w:r>
           </w:p>
         </w:tc>
@@ -1441,27 +1444,24 @@
       <w:tr>
         <w:tc>
           <w:tcPr>
-            <w:tcW w:type="dxa" w:w="3685"/>
+            <w:tcW w:type="dxa" w:w="4703"/>
           </w:tcPr>
           <w:p>
             <w:r>
               <w:rPr>
-                <w:sz w:val="20"/>
+                <w:b/>
               </w:rPr>
-              <w:t>backend/main.py</w:t>
+              <w:t>main.py</w:t>
             </w:r>
           </w:p>
         </w:tc>
         <w:tc>
           <w:tcPr>
-            <w:tcW w:type="dxa" w:w="5953"/>
+            <w:tcW w:type="dxa" w:w="4703"/>
           </w:tcPr>
           <w:p>
             <w:r>
-              <w:rPr>
-                <w:sz w:val="20"/>
-              </w:rPr>
-              <w:t>Core FastAPI server — all agents, streaming, Ralph Loop, file ops, stats</w:t>
+              <w:t>FastAPI backend — all agents, streaming, all 10 feature modules</w:t>
             </w:r>
           </w:p>
         </w:tc>
@@ -1469,29 +1469,24 @@
       <w:tr>
         <w:tc>
           <w:tcPr>
-            <w:tcW w:type="dxa" w:w="3685"/>
-            <w:shd w:fill="F4F3FD" w:val="clear"/>
+            <w:tcW w:type="dxa" w:w="4703"/>
           </w:tcPr>
           <w:p>
             <w:r>
               <w:rPr>
-                <w:sz w:val="20"/>
+                <w:b/>
               </w:rPr>
-              <w:t>backend/model_hub.py</w:t>
+              <w:t>scheduler.py</w:t>
             </w:r>
           </w:p>
         </w:tc>
         <w:tc>
           <w:tcPr>
-            <w:tcW w:type="dxa" w:w="5953"/>
-            <w:shd w:fill="F4F3FD" w:val="clear"/>
+            <w:tcW w:type="dxa" w:w="4703"/>
           </w:tcPr>
           <w:p>
             <w:r>
-              <w:rPr>
-                <w:sz w:val="20"/>
-              </w:rPr>
-              <w:t>HuggingFace search, GGUF model list, Ollama pull endpoint</w:t>
+              <w:t>Cron-style task scheduler</w:t>
             </w:r>
           </w:p>
         </w:tc>
@@ -1499,27 +1494,24 @@
       <w:tr>
         <w:tc>
           <w:tcPr>
-            <w:tcW w:type="dxa" w:w="3685"/>
+            <w:tcW w:type="dxa" w:w="4703"/>
           </w:tcPr>
           <w:p>
             <w:r>
               <w:rPr>
-                <w:sz w:val="20"/>
+                <w:b/>
               </w:rPr>
-              <w:t>backend/requirements.txt</w:t>
+              <w:t>memory.py</w:t>
             </w:r>
           </w:p>
         </w:tc>
         <w:tc>
           <w:tcPr>
-            <w:tcW w:type="dxa" w:w="5953"/>
+            <w:tcW w:type="dxa" w:w="4703"/>
           </w:tcPr>
           <w:p>
             <w:r>
-              <w:rPr>
-                <w:sz w:val="20"/>
-              </w:rPr>
-              <w:t>Python dependencies (fastapi, httpx, uvicorn, pydantic)</w:t>
+              <w:t>Project memory — persistent context per project</w:t>
             </w:r>
           </w:p>
         </w:tc>
@@ -1527,29 +1519,24 @@
       <w:tr>
         <w:tc>
           <w:tcPr>
-            <w:tcW w:type="dxa" w:w="3685"/>
-            <w:shd w:fill="F4F3FD" w:val="clear"/>
+            <w:tcW w:type="dxa" w:w="4703"/>
           </w:tcPr>
           <w:p>
             <w:r>
               <w:rPr>
-                <w:sz w:val="20"/>
+                <w:b/>
               </w:rPr>
-              <w:t>backend/Dockerfile</w:t>
+              <w:t>pipeline.py</w:t>
             </w:r>
           </w:p>
         </w:tc>
         <w:tc>
           <w:tcPr>
-            <w:tcW w:type="dxa" w:w="5953"/>
-            <w:shd w:fill="F4F3FD" w:val="clear"/>
+            <w:tcW w:type="dxa" w:w="4703"/>
           </w:tcPr>
           <w:p>
             <w:r>
-              <w:rPr>
-                <w:sz w:val="20"/>
-              </w:rPr>
-              <w:t>Container build for backend</w:t>
+              <w:t>Multi-agent pipeline orchestration</w:t>
             </w:r>
           </w:p>
         </w:tc>
@@ -1557,27 +1544,24 @@
       <w:tr>
         <w:tc>
           <w:tcPr>
-            <w:tcW w:type="dxa" w:w="3685"/>
+            <w:tcW w:type="dxa" w:w="4703"/>
           </w:tcPr>
           <w:p>
             <w:r>
               <w:rPr>
-                <w:sz w:val="20"/>
+                <w:b/>
               </w:rPr>
-              <w:t>frontend/src/App.jsx</w:t>
+              <w:t>audit.py</w:t>
             </w:r>
           </w:p>
         </w:tc>
         <w:tc>
           <w:tcPr>
-            <w:tcW w:type="dxa" w:w="5953"/>
+            <w:tcW w:type="dxa" w:w="4703"/>
           </w:tcPr>
           <w:p>
             <w:r>
-              <w:rPr>
-                <w:sz w:val="20"/>
-              </w:rPr>
-              <w:t>Root app — view routing, boot sequence</w:t>
+              <w:t>Timestamped audit log for every agent action</w:t>
             </w:r>
           </w:p>
         </w:tc>
@@ -1585,29 +1569,24 @@
       <w:tr>
         <w:tc>
           <w:tcPr>
-            <w:tcW w:type="dxa" w:w="3685"/>
-            <w:shd w:fill="F4F3FD" w:val="clear"/>
+            <w:tcW w:type="dxa" w:w="4703"/>
           </w:tcPr>
           <w:p>
             <w:r>
               <w:rPr>
-                <w:sz w:val="20"/>
+                <w:b/>
               </w:rPr>
-              <w:t>frontend/src/components/Sidebar.jsx</w:t>
+              <w:t>office_agents.py</w:t>
             </w:r>
           </w:p>
         </w:tc>
         <w:tc>
           <w:tcPr>
-            <w:tcW w:type="dxa" w:w="5953"/>
-            <w:shd w:fill="F4F3FD" w:val="clear"/>
+            <w:tcW w:type="dxa" w:w="4703"/>
           </w:tcPr>
           <w:p>
             <w:r>
-              <w:rPr>
-                <w:sz w:val="20"/>
-              </w:rPr>
-              <w:t>Navigation sidebar with all views and chat history</w:t>
+              <w:t>Generate .docx, .xlsx, .pptx from agent output</w:t>
             </w:r>
           </w:p>
         </w:tc>
@@ -1615,27 +1594,24 @@
       <w:tr>
         <w:tc>
           <w:tcPr>
-            <w:tcW w:type="dxa" w:w="3685"/>
+            <w:tcW w:type="dxa" w:w="4703"/>
           </w:tcPr>
           <w:p>
             <w:r>
               <w:rPr>
-                <w:sz w:val="20"/>
+                <w:b/>
               </w:rPr>
-              <w:t>frontend/src/components/MessageRenderer.jsx</w:t>
+              <w:t>web_search.py</w:t>
             </w:r>
           </w:p>
         </w:tc>
         <w:tc>
           <w:tcPr>
-            <w:tcW w:type="dxa" w:w="5953"/>
+            <w:tcW w:type="dxa" w:w="4703"/>
           </w:tcPr>
           <w:p>
             <w:r>
-              <w:rPr>
-                <w:sz w:val="20"/>
-              </w:rPr>
-              <w:t>Markdown + code highlighting + run/save buttons</w:t>
+              <w:t>DuckDuckGo live search with source citation</w:t>
             </w:r>
           </w:p>
         </w:tc>
@@ -1643,29 +1619,24 @@
       <w:tr>
         <w:tc>
           <w:tcPr>
-            <w:tcW w:type="dxa" w:w="3685"/>
-            <w:shd w:fill="F4F3FD" w:val="clear"/>
+            <w:tcW w:type="dxa" w:w="4703"/>
           </w:tcPr>
           <w:p>
             <w:r>
               <w:rPr>
-                <w:sz w:val="20"/>
+                <w:b/>
               </w:rPr>
-              <w:t>frontend/src/pages/DashboardView.jsx</w:t>
+              <w:t>auth.py</w:t>
             </w:r>
           </w:p>
         </w:tc>
         <w:tc>
           <w:tcPr>
-            <w:tcW w:type="dxa" w:w="5953"/>
-            <w:shd w:fill="F4F3FD" w:val="clear"/>
+            <w:tcW w:type="dxa" w:w="4703"/>
           </w:tcPr>
           <w:p>
             <w:r>
-              <w:rPr>
-                <w:sz w:val="20"/>
-              </w:rPr>
-              <w:t>Live stats dashboard with activity feed</w:t>
+              <w:t>Multi-user login, per-user workspace, admin panel</w:t>
             </w:r>
           </w:p>
         </w:tc>
@@ -1673,26 +1644,498 @@
       <w:tr>
         <w:tc>
           <w:tcPr>
-            <w:tcW w:type="dxa" w:w="3685"/>
+            <w:tcW w:type="dxa" w:w="4703"/>
           </w:tcPr>
           <w:p>
             <w:r>
               <w:rPr>
-                <w:sz w:val="20"/>
+                <w:b/>
               </w:rPr>
-              <w:t>frontend/src/pages/ChatView.jsx</w:t>
+              <w:t>model_hub.py</w:t>
             </w:r>
           </w:p>
         </w:tc>
         <w:tc>
           <w:tcPr>
-            <w:tcW w:type="dxa" w:w="5953"/>
+            <w:tcW w:type="dxa" w:w="4703"/>
+          </w:tcPr>
+          <w:p>
+            <w:r>
+              <w:t>HuggingFace GGUF model search, download, management</w:t>
+            </w:r>
+          </w:p>
+        </w:tc>
+      </w:tr>
+      <w:tr>
+        <w:tc>
+          <w:tcPr>
+            <w:tcW w:type="dxa" w:w="4703"/>
           </w:tcPr>
           <w:p>
             <w:r>
               <w:rPr>
-                <w:sz w:val="20"/>
+                <w:b/>
               </w:rPr>
+              <w:t>telegram_bot.py</w:t>
+            </w:r>
+          </w:p>
+        </w:tc>
+        <w:tc>
+          <w:tcPr>
+            <w:tcW w:type="dxa" w:w="4703"/>
+          </w:tcPr>
+          <w:p>
+            <w:r>
+              <w:t>Telegram bot — run tasks, get results via chat</w:t>
+            </w:r>
+          </w:p>
+        </w:tc>
+      </w:tr>
+      <w:tr>
+        <w:tc>
+          <w:tcPr>
+            <w:tcW w:type="dxa" w:w="4703"/>
+          </w:tcPr>
+          <w:p>
+            <w:r>
+              <w:rPr>
+                <w:b/>
+              </w:rPr>
+              <w:t>backup.py</w:t>
+            </w:r>
+          </w:p>
+        </w:tc>
+        <w:tc>
+          <w:tcPr>
+            <w:tcW w:type="dxa" w:w="4703"/>
+          </w:tcPr>
+          <w:p>
+            <w:r>
+              <w:t>Workspace backup and restore</w:t>
+            </w:r>
+          </w:p>
+        </w:tc>
+      </w:tr>
+      <w:tr>
+        <w:tc>
+          <w:tcPr>
+            <w:tcW w:type="dxa" w:w="4703"/>
+          </w:tcPr>
+          <w:p>
+            <w:r>
+              <w:rPr>
+                <w:b/>
+              </w:rPr>
+              <w:t>skill_eval.py</w:t>
+            </w:r>
+          </w:p>
+        </w:tc>
+        <w:tc>
+          <w:tcPr>
+            <w:tcW w:type="dxa" w:w="4703"/>
+          </w:tcPr>
+          <w:p>
+            <w:r>
+              <w:t>Benchmark agent quality across test prompts</w:t>
+            </w:r>
+          </w:p>
+        </w:tc>
+      </w:tr>
+      <w:tr>
+        <w:tc>
+          <w:tcPr>
+            <w:tcW w:type="dxa" w:w="4703"/>
+          </w:tcPr>
+          <w:p>
+            <w:r>
+              <w:rPr>
+                <w:b/>
+              </w:rPr>
+              <w:t>requirements.txt</w:t>
+            </w:r>
+          </w:p>
+        </w:tc>
+        <w:tc>
+          <w:tcPr>
+            <w:tcW w:type="dxa" w:w="4703"/>
+          </w:tcPr>
+          <w:p>
+            <w:r>
+              <w:t>Python dependencies</w:t>
+            </w:r>
+          </w:p>
+        </w:tc>
+      </w:tr>
+      <w:tr>
+        <w:tc>
+          <w:tcPr>
+            <w:tcW w:type="dxa" w:w="4703"/>
+          </w:tcPr>
+          <w:p>
+            <w:r>
+              <w:rPr>
+                <w:b/>
+              </w:rPr>
+              <w:t>Dockerfile</w:t>
+            </w:r>
+          </w:p>
+        </w:tc>
+        <w:tc>
+          <w:tcPr>
+            <w:tcW w:type="dxa" w:w="4703"/>
+          </w:tcPr>
+          <w:p>
+            <w:r>
+              <w:t>Container build</w:t>
+            </w:r>
+          </w:p>
+        </w:tc>
+      </w:tr>
+      <w:tr>
+        <w:tc>
+          <w:tcPr>
+            <w:tcW w:type="dxa" w:w="4703"/>
+          </w:tcPr>
+          <w:p>
+            <w:r>
+              <w:rPr>
+                <w:b/>
+              </w:rPr>
+              <w:t>docker-compose.yml</w:t>
+            </w:r>
+          </w:p>
+        </w:tc>
+        <w:tc>
+          <w:tcPr>
+            <w:tcW w:type="dxa" w:w="4703"/>
+          </w:tcPr>
+          <w:p>
+            <w:r>
+              <w:t>Full Docker deployment</w:t>
+            </w:r>
+          </w:p>
+        </w:tc>
+      </w:tr>
+      <w:tr>
+        <w:tc>
+          <w:tcPr>
+            <w:tcW w:type="dxa" w:w="4703"/>
+          </w:tcPr>
+          <w:p>
+            <w:r>
+              <w:rPr>
+                <w:b/>
+              </w:rPr>
+              <w:t>install.sh</w:t>
+            </w:r>
+          </w:p>
+        </w:tc>
+        <w:tc>
+          <w:tcPr>
+            <w:tcW w:type="dxa" w:w="4703"/>
+          </w:tcPr>
+          <w:p>
+            <w:r>
+              <w:t>One-command installer for Oracle Ubuntu VM</w:t>
+            </w:r>
+          </w:p>
+        </w:tc>
+      </w:tr>
+      <w:tr>
+        <w:tc>
+          <w:tcPr>
+            <w:tcW w:type="dxa" w:w="4703"/>
+          </w:tcPr>
+          <w:p>
+            <w:r>
+              <w:rPr>
+                <w:b/>
+              </w:rPr>
+              <w:t>install-windows.ps1</w:t>
+            </w:r>
+          </w:p>
+        </w:tc>
+        <w:tc>
+          <w:tcPr>
+            <w:tcW w:type="dxa" w:w="4703"/>
+          </w:tcPr>
+          <w:p>
+            <w:r>
+              <w:t>Windows installer</w:t>
+            </w:r>
+          </w:p>
+        </w:tc>
+      </w:tr>
+      <w:tr>
+        <w:tc>
+          <w:tcPr>
+            <w:tcW w:type="dxa" w:w="4703"/>
+          </w:tcPr>
+          <w:p>
+            <w:r>
+              <w:rPr>
+                <w:b/>
+              </w:rPr>
+              <w:t>start-dev.sh</w:t>
+            </w:r>
+          </w:p>
+        </w:tc>
+        <w:tc>
+          <w:tcPr>
+            <w:tcW w:type="dxa" w:w="4703"/>
+          </w:tcPr>
+          <w:p>
+            <w:r>
+              <w:t>Dev mode launcher (Linux/Mac)</w:t>
+            </w:r>
+          </w:p>
+        </w:tc>
+      </w:tr>
+      <w:tr>
+        <w:tc>
+          <w:tcPr>
+            <w:tcW w:type="dxa" w:w="4703"/>
+          </w:tcPr>
+          <w:p>
+            <w:r>
+              <w:rPr>
+                <w:b/>
+              </w:rPr>
+              <w:t>start-dev-windows.ps1</w:t>
+            </w:r>
+          </w:p>
+        </w:tc>
+        <w:tc>
+          <w:tcPr>
+            <w:tcW w:type="dxa" w:w="4703"/>
+          </w:tcPr>
+          <w:p>
+            <w:r>
+              <w:t>Dev mode launcher (Windows)</w:t>
+            </w:r>
+          </w:p>
+        </w:tc>
+      </w:tr>
+      <w:tr>
+        <w:tc>
+          <w:tcPr>
+            <w:tcW w:type="dxa" w:w="4703"/>
+          </w:tcPr>
+          <w:p>
+            <w:r>
+              <w:rPr>
+                <w:b/>
+              </w:rPr>
+              <w:t>index.jsx</w:t>
+            </w:r>
+          </w:p>
+        </w:tc>
+        <w:tc>
+          <w:tcPr>
+            <w:tcW w:type="dxa" w:w="4703"/>
+          </w:tcPr>
+          <w:p>
+            <w:r>
+              <w:t>React entry point</w:t>
+            </w:r>
+          </w:p>
+        </w:tc>
+      </w:tr>
+      <w:tr>
+        <w:tc>
+          <w:tcPr>
+            <w:tcW w:type="dxa" w:w="4703"/>
+          </w:tcPr>
+          <w:p>
+            <w:r>
+              <w:rPr>
+                <w:b/>
+              </w:rPr>
+              <w:t>App.jsx</w:t>
+            </w:r>
+          </w:p>
+        </w:tc>
+        <w:tc>
+          <w:tcPr>
+            <w:tcW w:type="dxa" w:w="4703"/>
+          </w:tcPr>
+          <w:p>
+            <w:r>
+              <w:t>Root component + view routing</w:t>
+            </w:r>
+          </w:p>
+        </w:tc>
+      </w:tr>
+      <w:tr>
+        <w:tc>
+          <w:tcPr>
+            <w:tcW w:type="dxa" w:w="4703"/>
+          </w:tcPr>
+          <w:p>
+            <w:r>
+              <w:rPr>
+                <w:b/>
+              </w:rPr>
+              <w:t>store.js</w:t>
+            </w:r>
+          </w:p>
+        </w:tc>
+        <w:tc>
+          <w:tcPr>
+            <w:tcW w:type="dxa" w:w="4703"/>
+          </w:tcPr>
+          <w:p>
+            <w:r>
+              <w:t>Zustand global state</w:t>
+            </w:r>
+          </w:p>
+        </w:tc>
+      </w:tr>
+      <w:tr>
+        <w:tc>
+          <w:tcPr>
+            <w:tcW w:type="dxa" w:w="4703"/>
+          </w:tcPr>
+          <w:p>
+            <w:r>
+              <w:rPr>
+                <w:b/>
+              </w:rPr>
+              <w:t>index.css</w:t>
+            </w:r>
+          </w:p>
+        </w:tc>
+        <w:tc>
+          <w:tcPr>
+            <w:tcW w:type="dxa" w:w="4703"/>
+          </w:tcPr>
+          <w:p>
+            <w:r>
+              <w:t>Tailwind CSS base styles</w:t>
+            </w:r>
+          </w:p>
+        </w:tc>
+      </w:tr>
+      <w:tr>
+        <w:tc>
+          <w:tcPr>
+            <w:tcW w:type="dxa" w:w="4703"/>
+          </w:tcPr>
+          <w:p>
+            <w:r>
+              <w:rPr>
+                <w:b/>
+              </w:rPr>
+              <w:t>vite.config.js</w:t>
+            </w:r>
+          </w:p>
+        </w:tc>
+        <w:tc>
+          <w:tcPr>
+            <w:tcW w:type="dxa" w:w="4703"/>
+          </w:tcPr>
+          <w:p>
+            <w:r>
+              <w:t>Vite build config with API proxy</w:t>
+            </w:r>
+          </w:p>
+        </w:tc>
+      </w:tr>
+      <w:tr>
+        <w:tc>
+          <w:tcPr>
+            <w:tcW w:type="dxa" w:w="4703"/>
+          </w:tcPr>
+          <w:p>
+            <w:r>
+              <w:rPr>
+                <w:b/>
+              </w:rPr>
+              <w:t>tailwind.config.js</w:t>
+            </w:r>
+          </w:p>
+        </w:tc>
+        <w:tc>
+          <w:tcPr>
+            <w:tcW w:type="dxa" w:w="4703"/>
+          </w:tcPr>
+          <w:p>
+            <w:r>
+              <w:t>Tailwind theme — dark palette, custom colours</w:t>
+            </w:r>
+          </w:p>
+        </w:tc>
+      </w:tr>
+      <w:tr>
+        <w:tc>
+          <w:tcPr>
+            <w:tcW w:type="dxa" w:w="4703"/>
+          </w:tcPr>
+          <w:p>
+            <w:r>
+              <w:rPr>
+                <w:b/>
+              </w:rPr>
+              <w:t>components/Sidebar.jsx</w:t>
+            </w:r>
+          </w:p>
+        </w:tc>
+        <w:tc>
+          <w:tcPr>
+            <w:tcW w:type="dxa" w:w="4703"/>
+          </w:tcPr>
+          <w:p>
+            <w:r>
+              <w:t>Navigation sidebar with all views</w:t>
+            </w:r>
+          </w:p>
+        </w:tc>
+      </w:tr>
+      <w:tr>
+        <w:tc>
+          <w:tcPr>
+            <w:tcW w:type="dxa" w:w="4703"/>
+          </w:tcPr>
+          <w:p>
+            <w:r>
+              <w:rPr>
+                <w:b/>
+              </w:rPr>
+              <w:t>components/MessageRenderer.jsx</w:t>
+            </w:r>
+          </w:p>
+        </w:tc>
+        <w:tc>
+          <w:tcPr>
+            <w:tcW w:type="dxa" w:w="4703"/>
+          </w:tcPr>
+          <w:p>
+            <w:r>
+              <w:t>Markdown + syntax highlighting + code run/save</w:t>
+            </w:r>
+          </w:p>
+        </w:tc>
+      </w:tr>
+      <w:tr>
+        <w:tc>
+          <w:tcPr>
+            <w:tcW w:type="dxa" w:w="4703"/>
+          </w:tcPr>
+          <w:p>
+            <w:r>
+              <w:rPr>
+                <w:b/>
+              </w:rPr>
+              <w:t>pages/ChatView.jsx</w:t>
+            </w:r>
+          </w:p>
+        </w:tc>
+        <w:tc>
+          <w:tcPr>
+            <w:tcW w:type="dxa" w:w="4703"/>
+          </w:tcPr>
+          <w:p>
+            <w:r>
               <w:t>Multi-agent streaming chat with voice input</w:t>
             </w:r>
           </w:p>
@@ -1701,28 +2144,48 @@
       <w:tr>
         <w:tc>
           <w:tcPr>
-            <w:tcW w:type="dxa" w:w="3685"/>
-            <w:shd w:fill="F4F3FD" w:val="clear"/>
+            <w:tcW w:type="dxa" w:w="4703"/>
           </w:tcPr>
           <w:p>
             <w:r>
               <w:rPr>
-                <w:sz w:val="20"/>
+                <w:b/>
               </w:rPr>
-              <w:t>frontend/src/pages/TasksView.jsx</w:t>
+              <w:t>pages/DashboardView.jsx</w:t>
             </w:r>
           </w:p>
         </w:tc>
         <w:tc>
           <w:tcPr>
-            <w:tcW w:type="dxa" w:w="5953"/>
-            <w:shd w:fill="F4F3FD" w:val="clear"/>
+            <w:tcW w:type="dxa" w:w="4703"/>
+          </w:tcPr>
+          <w:p>
+            <w:r>
+              <w:t>Live stats, activity feed, Ralph Loop metrics</w:t>
+            </w:r>
+          </w:p>
+        </w:tc>
+      </w:tr>
+      <w:tr>
+        <w:tc>
+          <w:tcPr>
+            <w:tcW w:type="dxa" w:w="4703"/>
           </w:tcPr>
           <w:p>
             <w:r>
               <w:rPr>
-                <w:sz w:val="20"/>
+                <w:b/>
               </w:rPr>
+              <w:t>pages/TasksView.jsx</w:t>
+            </w:r>
+          </w:p>
+        </w:tc>
+        <w:tc>
+          <w:tcPr>
+            <w:tcW w:type="dxa" w:w="4703"/>
+          </w:tcPr>
+          <w:p>
+            <w:r>
               <w:t>Autonomous task runner with Ralph Loop toggle</w:t>
             </w:r>
           </w:p>
@@ -1731,27 +2194,24 @@
       <w:tr>
         <w:tc>
           <w:tcPr>
-            <w:tcW w:type="dxa" w:w="3685"/>
+            <w:tcW w:type="dxa" w:w="4703"/>
           </w:tcPr>
           <w:p>
             <w:r>
               <w:rPr>
-                <w:sz w:val="20"/>
+                <w:b/>
               </w:rPr>
-              <w:t>frontend/src/pages/ModelHubView.jsx</w:t>
+              <w:t>pages/PipelineView.jsx</w:t>
             </w:r>
           </w:p>
         </w:tc>
         <w:tc>
           <w:tcPr>
-            <w:tcW w:type="dxa" w:w="5953"/>
+            <w:tcW w:type="dxa" w:w="4703"/>
           </w:tcPr>
           <w:p>
             <w:r>
-              <w:rPr>
-                <w:sz w:val="20"/>
-              </w:rPr>
-              <w:t>HuggingFace GGUF browser + one-click installer</w:t>
+              <w:t>Multi-agent pipeline stage tracker</w:t>
             </w:r>
           </w:p>
         </w:tc>
@@ -1759,29 +2219,24 @@
       <w:tr>
         <w:tc>
           <w:tcPr>
-            <w:tcW w:type="dxa" w:w="3685"/>
-            <w:shd w:fill="F4F3FD" w:val="clear"/>
+            <w:tcW w:type="dxa" w:w="4703"/>
           </w:tcPr>
           <w:p>
             <w:r>
               <w:rPr>
-                <w:sz w:val="20"/>
+                <w:b/>
               </w:rPr>
-              <w:t>frontend/src/pages/FilesView.jsx</w:t>
+              <w:t>pages/AppBuilderView.jsx</w:t>
             </w:r>
           </w:p>
         </w:tc>
         <w:tc>
           <w:tcPr>
-            <w:tcW w:type="dxa" w:w="5953"/>
-            <w:shd w:fill="F4F3FD" w:val="clear"/>
+            <w:tcW w:type="dxa" w:w="4703"/>
           </w:tcPr>
           <w:p>
             <w:r>
-              <w:rPr>
-                <w:sz w:val="20"/>
-              </w:rPr>
-              <w:t>File workspace — view, edit, download, delete</w:t>
+              <w:t>Full-app generator with preview and zip download</w:t>
             </w:r>
           </w:p>
         </w:tc>
@@ -1789,26 +2244,273 @@
       <w:tr>
         <w:tc>
           <w:tcPr>
-            <w:tcW w:type="dxa" w:w="3685"/>
+            <w:tcW w:type="dxa" w:w="4703"/>
           </w:tcPr>
           <w:p>
             <w:r>
               <w:rPr>
-                <w:sz w:val="20"/>
+                <w:b/>
               </w:rPr>
-              <w:t>frontend/src/pages/SettingsView.jsx</w:t>
+              <w:t>pages/CanvasView.jsx</w:t>
             </w:r>
           </w:p>
         </w:tc>
         <w:tc>
           <w:tcPr>
-            <w:tcW w:type="dxa" w:w="5953"/>
+            <w:tcW w:type="dxa" w:w="4703"/>
+          </w:tcPr>
+          <w:p>
+            <w:r>
+              <w:t>Drag-and-drop visual workflow editor</w:t>
+            </w:r>
+          </w:p>
+        </w:tc>
+      </w:tr>
+      <w:tr>
+        <w:tc>
+          <w:tcPr>
+            <w:tcW w:type="dxa" w:w="4703"/>
           </w:tcPr>
           <w:p>
             <w:r>
               <w:rPr>
-                <w:sz w:val="20"/>
+                <w:b/>
               </w:rPr>
+              <w:t>pages/OfficeView.jsx</w:t>
+            </w:r>
+          </w:p>
+        </w:tc>
+        <w:tc>
+          <w:tcPr>
+            <w:tcW w:type="dxa" w:w="4703"/>
+          </w:tcPr>
+          <w:p>
+            <w:r>
+              <w:t>Office document generator</w:t>
+            </w:r>
+          </w:p>
+        </w:tc>
+      </w:tr>
+      <w:tr>
+        <w:tc>
+          <w:tcPr>
+            <w:tcW w:type="dxa" w:w="4703"/>
+          </w:tcPr>
+          <w:p>
+            <w:r>
+              <w:rPr>
+                <w:b/>
+              </w:rPr>
+              <w:t>pages/FilesView.jsx</w:t>
+            </w:r>
+          </w:p>
+        </w:tc>
+        <w:tc>
+          <w:tcPr>
+            <w:tcW w:type="dxa" w:w="4703"/>
+          </w:tcPr>
+          <w:p>
+            <w:r>
+              <w:t>File workspace — view, edit, download</w:t>
+            </w:r>
+          </w:p>
+        </w:tc>
+      </w:tr>
+      <w:tr>
+        <w:tc>
+          <w:tcPr>
+            <w:tcW w:type="dxa" w:w="4703"/>
+          </w:tcPr>
+          <w:p>
+            <w:r>
+              <w:rPr>
+                <w:b/>
+              </w:rPr>
+              <w:t>pages/MemoryView.jsx</w:t>
+            </w:r>
+          </w:p>
+        </w:tc>
+        <w:tc>
+          <w:tcPr>
+            <w:tcW w:type="dxa" w:w="4703"/>
+          </w:tcPr>
+          <w:p>
+            <w:r>
+              <w:t>Project memory viewer and editor</w:t>
+            </w:r>
+          </w:p>
+        </w:tc>
+      </w:tr>
+      <w:tr>
+        <w:tc>
+          <w:tcPr>
+            <w:tcW w:type="dxa" w:w="4703"/>
+          </w:tcPr>
+          <w:p>
+            <w:r>
+              <w:rPr>
+                <w:b/>
+              </w:rPr>
+              <w:t>pages/SchedulerView.jsx</w:t>
+            </w:r>
+          </w:p>
+        </w:tc>
+        <w:tc>
+          <w:tcPr>
+            <w:tcW w:type="dxa" w:w="4703"/>
+          </w:tcPr>
+          <w:p>
+            <w:r>
+              <w:t>Cron job manager with next-run countdown</w:t>
+            </w:r>
+          </w:p>
+        </w:tc>
+      </w:tr>
+      <w:tr>
+        <w:tc>
+          <w:tcPr>
+            <w:tcW w:type="dxa" w:w="4703"/>
+          </w:tcPr>
+          <w:p>
+            <w:r>
+              <w:rPr>
+                <w:b/>
+              </w:rPr>
+              <w:t>pages/ModelHubView.jsx</w:t>
+            </w:r>
+          </w:p>
+        </w:tc>
+        <w:tc>
+          <w:tcPr>
+            <w:tcW w:type="dxa" w:w="4703"/>
+          </w:tcPr>
+          <w:p>
+            <w:r>
+              <w:t>HuggingFace model browser and installer</w:t>
+            </w:r>
+          </w:p>
+        </w:tc>
+      </w:tr>
+      <w:tr>
+        <w:tc>
+          <w:tcPr>
+            <w:tcW w:type="dxa" w:w="4703"/>
+          </w:tcPr>
+          <w:p>
+            <w:r>
+              <w:rPr>
+                <w:b/>
+              </w:rPr>
+              <w:t>pages/CodeReviewView.jsx</w:t>
+            </w:r>
+          </w:p>
+        </w:tc>
+        <w:tc>
+          <w:tcPr>
+            <w:tcW w:type="dxa" w:w="4703"/>
+          </w:tcPr>
+          <w:p>
+            <w:r>
+              <w:t>Code review with auto-fix and diff view</w:t>
+            </w:r>
+          </w:p>
+        </w:tc>
+      </w:tr>
+      <w:tr>
+        <w:tc>
+          <w:tcPr>
+            <w:tcW w:type="dxa" w:w="4703"/>
+          </w:tcPr>
+          <w:p>
+            <w:r>
+              <w:rPr>
+                <w:b/>
+              </w:rPr>
+              <w:t>pages/AuditView.jsx</w:t>
+            </w:r>
+          </w:p>
+        </w:tc>
+        <w:tc>
+          <w:tcPr>
+            <w:tcW w:type="dxa" w:w="4703"/>
+          </w:tcPr>
+          <w:p>
+            <w:r>
+              <w:t>Audit log viewer</w:t>
+            </w:r>
+          </w:p>
+        </w:tc>
+      </w:tr>
+      <w:tr>
+        <w:tc>
+          <w:tcPr>
+            <w:tcW w:type="dxa" w:w="4703"/>
+          </w:tcPr>
+          <w:p>
+            <w:r>
+              <w:rPr>
+                <w:b/>
+              </w:rPr>
+              <w:t>pages/TelegramView.jsx</w:t>
+            </w:r>
+          </w:p>
+        </w:tc>
+        <w:tc>
+          <w:tcPr>
+            <w:tcW w:type="dxa" w:w="4703"/>
+          </w:tcPr>
+          <w:p>
+            <w:r>
+              <w:t>Telegram bot config and status</w:t>
+            </w:r>
+          </w:p>
+        </w:tc>
+      </w:tr>
+      <w:tr>
+        <w:tc>
+          <w:tcPr>
+            <w:tcW w:type="dxa" w:w="4703"/>
+          </w:tcPr>
+          <w:p>
+            <w:r>
+              <w:rPr>
+                <w:b/>
+              </w:rPr>
+              <w:t>pages/BackupView.jsx</w:t>
+            </w:r>
+          </w:p>
+        </w:tc>
+        <w:tc>
+          <w:tcPr>
+            <w:tcW w:type="dxa" w:w="4703"/>
+          </w:tcPr>
+          <w:p>
+            <w:r>
+              <w:t>Workspace backup and restore UI</w:t>
+            </w:r>
+          </w:p>
+        </w:tc>
+      </w:tr>
+      <w:tr>
+        <w:tc>
+          <w:tcPr>
+            <w:tcW w:type="dxa" w:w="4703"/>
+          </w:tcPr>
+          <w:p>
+            <w:r>
+              <w:rPr>
+                <w:b/>
+              </w:rPr>
+              <w:t>pages/SettingsView.jsx</w:t>
+            </w:r>
+          </w:p>
+        </w:tc>
+        <w:tc>
+          <w:tcPr>
+            <w:tcW w:type="dxa" w:w="4703"/>
+          </w:tcPr>
+          <w:p>
+            <w:r>
               <w:t>Ollama connection, model selection, health check</w:t>
             </w:r>
           </w:p>
@@ -1817,28 +2519,98 @@
       <w:tr>
         <w:tc>
           <w:tcPr>
-            <w:tcW w:type="dxa" w:w="3685"/>
-            <w:shd w:fill="F4F3FD" w:val="clear"/>
+            <w:tcW w:type="dxa" w:w="4703"/>
           </w:tcPr>
           <w:p>
             <w:r>
               <w:rPr>
-                <w:sz w:val="20"/>
+                <w:b/>
               </w:rPr>
-              <w:t>frontend/src/pages/VoiceButton.jsx</w:t>
+              <w:t>pages/SkillsView.jsx</w:t>
             </w:r>
           </w:p>
         </w:tc>
         <w:tc>
           <w:tcPr>
-            <w:tcW w:type="dxa" w:w="5953"/>
-            <w:shd w:fill="F4F3FD" w:val="clear"/>
+            <w:tcW w:type="dxa" w:w="4703"/>
+          </w:tcPr>
+          <w:p>
+            <w:r>
+              <w:t>Agent skill library manager</w:t>
+            </w:r>
+          </w:p>
+        </w:tc>
+      </w:tr>
+      <w:tr>
+        <w:tc>
+          <w:tcPr>
+            <w:tcW w:type="dxa" w:w="4703"/>
           </w:tcPr>
           <w:p>
             <w:r>
               <w:rPr>
-                <w:sz w:val="20"/>
+                <w:b/>
               </w:rPr>
+              <w:t>pages/UsersView.jsx</w:t>
+            </w:r>
+          </w:p>
+        </w:tc>
+        <w:tc>
+          <w:tcPr>
+            <w:tcW w:type="dxa" w:w="4703"/>
+          </w:tcPr>
+          <w:p>
+            <w:r>
+              <w:t>User management (admin only)</w:t>
+            </w:r>
+          </w:p>
+        </w:tc>
+      </w:tr>
+      <w:tr>
+        <w:tc>
+          <w:tcPr>
+            <w:tcW w:type="dxa" w:w="4703"/>
+          </w:tcPr>
+          <w:p>
+            <w:r>
+              <w:rPr>
+                <w:b/>
+              </w:rPr>
+              <w:t>pages/PromptsView.jsx</w:t>
+            </w:r>
+          </w:p>
+        </w:tc>
+        <w:tc>
+          <w:tcPr>
+            <w:tcW w:type="dxa" w:w="4703"/>
+          </w:tcPr>
+          <w:p>
+            <w:r>
+              <w:t>Saved prompt library</w:t>
+            </w:r>
+          </w:p>
+        </w:tc>
+      </w:tr>
+      <w:tr>
+        <w:tc>
+          <w:tcPr>
+            <w:tcW w:type="dxa" w:w="4703"/>
+          </w:tcPr>
+          <w:p>
+            <w:r>
+              <w:rPr>
+                <w:b/>
+              </w:rPr>
+              <w:t>pages/VoiceButton.jsx</w:t>
+            </w:r>
+          </w:p>
+        </w:tc>
+        <w:tc>
+          <w:tcPr>
+            <w:tcW w:type="dxa" w:w="4703"/>
+          </w:tcPr>
+          <w:p>
+            <w:r>
               <w:t>Microphone voice input component</w:t>
             </w:r>
           </w:p>
@@ -1847,143 +2619,24 @@
       <w:tr>
         <w:tc>
           <w:tcPr>
-            <w:tcW w:type="dxa" w:w="3685"/>
+            <w:tcW w:type="dxa" w:w="4703"/>
           </w:tcPr>
           <w:p>
             <w:r>
               <w:rPr>
-                <w:sz w:val="20"/>
+                <w:b/>
               </w:rPr>
-              <w:t>frontend/src/store/index.js</w:t>
+              <w:t>utils/api.js</w:t>
             </w:r>
           </w:p>
         </w:tc>
         <w:tc>
           <w:tcPr>
-            <w:tcW w:type="dxa" w:w="5953"/>
+            <w:tcW w:type="dxa" w:w="4703"/>
           </w:tcPr>
           <w:p>
             <w:r>
-              <w:rPr>
-                <w:sz w:val="20"/>
-              </w:rPr>
-              <w:t>Zustand global state store</w:t>
-            </w:r>
-          </w:p>
-        </w:tc>
-      </w:tr>
-      <w:tr>
-        <w:tc>
-          <w:tcPr>
-            <w:tcW w:type="dxa" w:w="3685"/>
-            <w:shd w:fill="F4F3FD" w:val="clear"/>
-          </w:tcPr>
-          <w:p>
-            <w:r>
-              <w:rPr>
-                <w:sz w:val="20"/>
-              </w:rPr>
-              <w:t>frontend/src/utils/api.js</w:t>
-            </w:r>
-          </w:p>
-        </w:tc>
-        <w:tc>
-          <w:tcPr>
-            <w:tcW w:type="dxa" w:w="5953"/>
-            <w:shd w:fill="F4F3FD" w:val="clear"/>
-          </w:tcPr>
-          <w:p>
-            <w:r>
-              <w:rPr>
-                <w:sz w:val="20"/>
-              </w:rPr>
               <w:t>All backend API calls including streaming</w:t>
-            </w:r>
-          </w:p>
-        </w:tc>
-      </w:tr>
-      <w:tr>
-        <w:tc>
-          <w:tcPr>
-            <w:tcW w:type="dxa" w:w="3685"/>
-          </w:tcPr>
-          <w:p>
-            <w:r>
-              <w:rPr>
-                <w:sz w:val="20"/>
-              </w:rPr>
-              <w:t>docker-compose.yml</w:t>
-            </w:r>
-          </w:p>
-        </w:tc>
-        <w:tc>
-          <w:tcPr>
-            <w:tcW w:type="dxa" w:w="5953"/>
-          </w:tcPr>
-          <w:p>
-            <w:r>
-              <w:rPr>
-                <w:sz w:val="20"/>
-              </w:rPr>
-              <w:t>Full Docker deployment definition</w:t>
-            </w:r>
-          </w:p>
-        </w:tc>
-      </w:tr>
-      <w:tr>
-        <w:tc>
-          <w:tcPr>
-            <w:tcW w:type="dxa" w:w="3685"/>
-            <w:shd w:fill="F4F3FD" w:val="clear"/>
-          </w:tcPr>
-          <w:p>
-            <w:r>
-              <w:rPr>
-                <w:sz w:val="20"/>
-              </w:rPr>
-              <w:t>install.sh</w:t>
-            </w:r>
-          </w:p>
-        </w:tc>
-        <w:tc>
-          <w:tcPr>
-            <w:tcW w:type="dxa" w:w="5953"/>
-            <w:shd w:fill="F4F3FD" w:val="clear"/>
-          </w:tcPr>
-          <w:p>
-            <w:r>
-              <w:rPr>
-                <w:sz w:val="20"/>
-              </w:rPr>
-              <w:t>One-command installer for Oracle Ubuntu VM</w:t>
-            </w:r>
-          </w:p>
-        </w:tc>
-      </w:tr>
-      <w:tr>
-        <w:tc>
-          <w:tcPr>
-            <w:tcW w:type="dxa" w:w="3685"/>
-          </w:tcPr>
-          <w:p>
-            <w:r>
-              <w:rPr>
-                <w:sz w:val="20"/>
-              </w:rPr>
-              <w:t>start-dev.sh</w:t>
-            </w:r>
-          </w:p>
-        </w:tc>
-        <w:tc>
-          <w:tcPr>
-            <w:tcW w:type="dxa" w:w="5953"/>
-          </w:tcPr>
-          <w:p>
-            <w:r>
-              <w:rPr>
-                <w:sz w:val="20"/>
-              </w:rPr>
-              <w:t>Dev mode launcher (no Docker required)</w:t>
             </w:r>
           </w:p>
         </w:tc>
@@ -2035,14 +2688,13 @@
           <w:color w:val="2E7D32"/>
           <w:sz w:val="20"/>
         </w:rPr>
-        <w:t xml:space="preserve">Priority: High   </w:t>
+        <w:t>Status: Completed</w:t>
       </w:r>
       <w:r>
         <w:rPr>
           <w:color w:val="78788C"/>
           <w:sz w:val="20"/>
         </w:rPr>
-        <w:t>Target: v3.0</w:t>
       </w:r>
     </w:p>
     <w:p>
@@ -2134,14 +2786,13 @@
           <w:color w:val="2E7D32"/>
           <w:sz w:val="20"/>
         </w:rPr>
-        <w:t xml:space="preserve">Priority: High   </w:t>
+        <w:t>Status: Completed</w:t>
       </w:r>
       <w:r>
         <w:rPr>
           <w:color w:val="78788C"/>
           <w:sz w:val="20"/>
         </w:rPr>
-        <w:t>Target: v3.1</w:t>
       </w:r>
     </w:p>
     <w:p>
@@ -2233,14 +2884,13 @@
           <w:color w:val="2E7D32"/>
           <w:sz w:val="20"/>
         </w:rPr>
-        <w:t xml:space="preserve">Priority: High   </w:t>
+        <w:t>Status: Completed</w:t>
       </w:r>
       <w:r>
         <w:rPr>
           <w:color w:val="78788C"/>
           <w:sz w:val="20"/>
         </w:rPr>
-        <w:t>Target: v3.2</w:t>
       </w:r>
     </w:p>
     <w:p>
@@ -2332,14 +2982,13 @@
           <w:color w:val="2E7D32"/>
           <w:sz w:val="20"/>
         </w:rPr>
-        <w:t xml:space="preserve">Priority: High   </w:t>
+        <w:t>Status: Completed</w:t>
       </w:r>
       <w:r>
         <w:rPr>
           <w:color w:val="78788C"/>
           <w:sz w:val="20"/>
         </w:rPr>
-        <w:t>Target: v3.3</w:t>
       </w:r>
     </w:p>
     <w:p>
@@ -2431,14 +3080,13 @@
           <w:color w:val="E65100"/>
           <w:sz w:val="20"/>
         </w:rPr>
-        <w:t xml:space="preserve">Priority: Medium   </w:t>
+        <w:t>Status: Completed</w:t>
       </w:r>
       <w:r>
         <w:rPr>
           <w:color w:val="78788C"/>
           <w:sz w:val="20"/>
         </w:rPr>
-        <w:t>Target: v3.4</w:t>
       </w:r>
     </w:p>
     <w:p>
@@ -2530,14 +3178,13 @@
           <w:color w:val="E65100"/>
           <w:sz w:val="20"/>
         </w:rPr>
-        <w:t xml:space="preserve">Priority: Medium   </w:t>
+        <w:t>Status: Completed</w:t>
       </w:r>
       <w:r>
         <w:rPr>
           <w:color w:val="78788C"/>
           <w:sz w:val="20"/>
         </w:rPr>
-        <w:t>Target: v3.5</w:t>
       </w:r>
     </w:p>
     <w:p>
@@ -2629,14 +3276,13 @@
           <w:color w:val="E65100"/>
           <w:sz w:val="20"/>
         </w:rPr>
-        <w:t xml:space="preserve">Priority: Medium   </w:t>
+        <w:t>Status: Completed</w:t>
       </w:r>
       <w:r>
         <w:rPr>
           <w:color w:val="78788C"/>
           <w:sz w:val="20"/>
         </w:rPr>
-        <w:t>Target: v4.0</w:t>
       </w:r>
     </w:p>
     <w:p>
@@ -2728,14 +3374,13 @@
           <w:color w:val="E65100"/>
           <w:sz w:val="20"/>
         </w:rPr>
-        <w:t xml:space="preserve">Priority: Medium   </w:t>
+        <w:t>Status: Completed</w:t>
       </w:r>
       <w:r>
         <w:rPr>
           <w:color w:val="78788C"/>
           <w:sz w:val="20"/>
         </w:rPr>
-        <w:t>Target: v4.1</w:t>
       </w:r>
     </w:p>
     <w:p>
@@ -2827,14 +3472,13 @@
           <w:color w:val="1565C0"/>
           <w:sz w:val="20"/>
         </w:rPr>
-        <w:t xml:space="preserve">Priority: Low   </w:t>
+        <w:t>Status: Completed</w:t>
       </w:r>
       <w:r>
         <w:rPr>
           <w:color w:val="78788C"/>
           <w:sz w:val="20"/>
         </w:rPr>
-        <w:t>Target: v4.2</w:t>
       </w:r>
     </w:p>
     <w:p>
@@ -2926,14 +3570,13 @@
           <w:color w:val="1565C0"/>
           <w:sz w:val="20"/>
         </w:rPr>
-        <w:t xml:space="preserve">Priority: Low   </w:t>
+        <w:t>Status: Completed</w:t>
       </w:r>
       <w:r>
         <w:rPr>
           <w:color w:val="78788C"/>
           <w:sz w:val="20"/>
         </w:rPr>
-        <w:t>Target: v5.0</w:t>
       </w:r>
     </w:p>
     <w:p>
@@ -3009,6 +3652,758 @@
         </w:pBdr>
         <w:spacing w:after="160"/>
       </w:pPr>
+    </w:p>
+    <w:p>
+      <w:pPr>
+        <w:pStyle w:val="Normal"/>
+      </w:pPr>
+      <w:r>
+        <w:t xml:space="preserve"/>
+      </w:r>
+    </w:p>
+    <w:p>
+      <w:pPr>
+        <w:pStyle w:val="List Bullet"/>
+      </w:pPr>
+      <w:r>
+        <w:t xml:space="preserve">Estimated effort: 5-6 days</w:t>
+      </w:r>
+    </w:p>
+    <w:p>
+      <w:pPr>
+        <w:pStyle w:val="List Bullet"/>
+      </w:pPr>
+      <w:r>
+        <w:t xml:space="preserve">API: GET /api/plugins, POST /api/plugins/run, DELETE /api/plugins/{id}</w:t>
+      </w:r>
+    </w:p>
+    <w:p>
+      <w:pPr>
+        <w:pStyle w:val="List Bullet"/>
+      </w:pPr>
+      <w:r>
+        <w:t xml:space="preserve">New frontend page: PluginsView.jsx</w:t>
+      </w:r>
+    </w:p>
+    <w:p>
+      <w:pPr>
+        <w:pStyle w:val="List Bullet"/>
+      </w:pPr>
+      <w:r>
+        <w:t xml:space="preserve">Response parser: detect JSON tool calls in agent output and execute them</w:t>
+      </w:r>
+    </w:p>
+    <w:p>
+      <w:pPr>
+        <w:pStyle w:val="List Bullet"/>
+      </w:pPr>
+      <w:r>
+        <w:t xml:space="preserve">Agent system prompt updated to include available tool list and call format</w:t>
+      </w:r>
+    </w:p>
+    <w:p>
+      <w:pPr>
+        <w:pStyle w:val="List Bullet"/>
+      </w:pPr>
+      <w:r>
+        <w:t xml:space="preserve">Plugin manifest schema: JSON with name, description, parameters (JSON Schema format)</w:t>
+      </w:r>
+    </w:p>
+    <w:p>
+      <w:pPr>
+        <w:pStyle w:val="List Bullet"/>
+      </w:pPr>
+      <w:r>
+        <w:t xml:space="preserve">New backend module: plugin_manager.py (discover, validate, execute plugins)</w:t>
+      </w:r>
+    </w:p>
+    <w:p>
+      <w:pPr>
+        <w:pStyle w:val="Normal"/>
+      </w:pPr>
+      <w:r>
+        <w:rPr>
+          <w:b/>
+        </w:rPr>
+        <w:t xml:space="preserve">Technical requirements:</w:t>
+      </w:r>
+    </w:p>
+    <w:p>
+      <w:pPr>
+        <w:pStyle w:val="List Bullet"/>
+      </w:pPr>
+      <w:r>
+        <w:t xml:space="preserve">Ship 5 built-in plugins: calculator, weather (wttr.in, no key), currency rates, QR code, date/time</w:t>
+      </w:r>
+    </w:p>
+    <w:p>
+      <w:pPr>
+        <w:pStyle w:val="List Bullet"/>
+      </w:pPr>
+      <w:r>
+        <w:t xml:space="preserve">Add a Plugins view: list installed plugins, enable per agent, install from URL</w:t>
+      </w:r>
+    </w:p>
+    <w:p>
+      <w:pPr>
+        <w:pStyle w:val="List Bullet"/>
+      </w:pPr>
+      <w:r>
+        <w:t xml:space="preserve">Agents receive a tool list and can call tools using a structured JSON call format</w:t>
+      </w:r>
+    </w:p>
+    <w:p>
+      <w:pPr>
+        <w:pStyle w:val="List Bullet"/>
+      </w:pPr>
+      <w:r>
+        <w:t xml:space="preserve">Backend discovers and loads plugins from the ./plugins/ directory at startup</w:t>
+      </w:r>
+    </w:p>
+    <w:p>
+      <w:pPr>
+        <w:pStyle w:val="List Bullet"/>
+      </w:pPr>
+      <w:r>
+        <w:t xml:space="preserve">Each plugin is a Python file with a single run(params) -&gt; str function</w:t>
+      </w:r>
+    </w:p>
+    <w:p>
+      <w:pPr>
+        <w:pStyle w:val="List Bullet"/>
+      </w:pPr>
+      <w:r>
+        <w:t xml:space="preserve">Define a plugin manifest: plugins/my_tool/manifest.json with name, description, input schema</w:t>
+      </w:r>
+    </w:p>
+    <w:p>
+      <w:pPr>
+        <w:pStyle w:val="Normal"/>
+      </w:pPr>
+      <w:r>
+        <w:rPr>
+          <w:b/>
+        </w:rPr>
+        <w:t xml:space="preserve">How to implement:</w:t>
+      </w:r>
+    </w:p>
+    <w:p>
+      <w:pPr>
+        <w:pStyle w:val="Normal"/>
+      </w:pPr>
+      <w:r>
+        <w:t xml:space="preserve">Why: Every new capability (web search, git, office files) currently requires changes to main.py. A plugin system lets agents call external tools via a standard interface, and lets advanced users add custom tools without touching core code.</w:t>
+      </w:r>
+    </w:p>
+    <w:p>
+      <w:pPr>
+        <w:pStyle w:val="Normal"/>
+      </w:pPr>
+      <w:r>
+        <w:rPr>
+          <w:b/>
+        </w:rPr>
+        <w:t xml:space="preserve">Enhancement 5: Agent Plugin System</w:t>
+      </w:r>
+    </w:p>
+    <w:p>
+      <w:pPr>
+        <w:pStyle w:val="Normal"/>
+      </w:pPr>
+      <w:r>
+        <w:t xml:space="preserve"/>
+      </w:r>
+    </w:p>
+    <w:p>
+      <w:pPr>
+        <w:pStyle w:val="List Bullet"/>
+      </w:pPr>
+      <w:r>
+        <w:t xml:space="preserve">Estimated effort: 3-4 days</w:t>
+      </w:r>
+    </w:p>
+    <w:p>
+      <w:pPr>
+        <w:pStyle w:val="List Bullet"/>
+      </w:pPr>
+      <w:r>
+        <w:t xml:space="preserve">Sandbox: subprocess with timeout and resource limits</w:t>
+      </w:r>
+    </w:p>
+    <w:p>
+      <w:pPr>
+        <w:pStyle w:val="List Bullet"/>
+      </w:pPr>
+      <w:r>
+        <w:t xml:space="preserve">Frontend: test result panel added to MessageRenderer.jsx</w:t>
+      </w:r>
+    </w:p>
+    <w:p>
+      <w:pPr>
+        <w:pStyle w:val="List Bullet"/>
+      </w:pPr>
+      <w:r>
+        <w:t xml:space="preserve">API: POST /api/run-tests { code, language }</w:t>
+      </w:r>
+    </w:p>
+    <w:p>
+      <w:pPr>
+        <w:pStyle w:val="List Bullet"/>
+      </w:pPr>
+      <w:r>
+        <w:t xml:space="preserve">New backend module: test_runner.py (LLM-generate tests, run in sandbox)</w:t>
+      </w:r>
+    </w:p>
+    <w:p>
+      <w:pPr>
+        <w:pStyle w:val="List Bullet"/>
+      </w:pPr>
+      <w:r>
+        <w:t xml:space="preserve">No new pip dependencies (subprocess + pytest already present)</w:t>
+      </w:r>
+    </w:p>
+    <w:p>
+      <w:pPr>
+        <w:pStyle w:val="Normal"/>
+      </w:pPr>
+      <w:r>
+        <w:rPr>
+          <w:b/>
+        </w:rPr>
+        <w:t xml:space="preserve">Technical requirements:</w:t>
+      </w:r>
+    </w:p>
+    <w:p>
+      <w:pPr>
+        <w:pStyle w:val="List Bullet"/>
+      </w:pPr>
+      <w:r>
+        <w:t xml:space="preserve">JavaScript support via Node + Jest for React/JS code</w:t>
+      </w:r>
+    </w:p>
+    <w:p>
+      <w:pPr>
+        <w:pStyle w:val="List Bullet"/>
+      </w:pPr>
+      <w:r>
+        <w:t xml:space="preserve">Dashboard adds a Tests run counter and pass rate metric</w:t>
+      </w:r>
+    </w:p>
+    <w:p>
+      <w:pPr>
+        <w:pStyle w:val="List Bullet"/>
+      </w:pPr>
+      <w:r>
+        <w:t xml:space="preserve">If tests fail, the failure output is fed into another Ralph Loop iteration</w:t>
+      </w:r>
+    </w:p>
+    <w:p>
+      <w:pPr>
+        <w:pStyle w:val="List Bullet"/>
+      </w:pPr>
+      <w:r>
+        <w:t xml:space="preserve">Pass/fail result and stdout shown in a collapsible panel below the code block</w:t>
+      </w:r>
+    </w:p>
+    <w:p>
+      <w:pPr>
+        <w:pStyle w:val="List Bullet"/>
+      </w:pPr>
+      <w:r>
+        <w:t xml:space="preserve">Backend runs tests in an isolated subprocess with a 30-second timeout</w:t>
+      </w:r>
+    </w:p>
+    <w:p>
+      <w:pPr>
+        <w:pStyle w:val="List Bullet"/>
+      </w:pPr>
+      <w:r>
+        <w:t xml:space="preserve">After Coder writes Python, Test Agent generates a pytest file automatically</w:t>
+      </w:r>
+    </w:p>
+    <w:p>
+      <w:pPr>
+        <w:pStyle w:val="Normal"/>
+      </w:pPr>
+      <w:r>
+        <w:rPr>
+          <w:b/>
+        </w:rPr>
+        <w:t xml:space="preserve">How to implement:</w:t>
+      </w:r>
+    </w:p>
+    <w:p>
+      <w:pPr>
+        <w:pStyle w:val="Normal"/>
+      </w:pPr>
+      <w:r>
+        <w:t xml:space="preserve">Why: Ralph Loop checks output quality via LLM review but never actually runs the code. An Automated Test Runner writes pytest tests for generated Python code, runs them in a sandbox, and feeds real pass/fail results back into Ralph Loop.</w:t>
+      </w:r>
+    </w:p>
+    <w:p>
+      <w:pPr>
+        <w:pStyle w:val="Normal"/>
+      </w:pPr>
+      <w:r>
+        <w:rPr>
+          <w:b/>
+        </w:rPr>
+        <w:t xml:space="preserve">Enhancement 4: Automated Test Runner</w:t>
+      </w:r>
+    </w:p>
+    <w:p>
+      <w:pPr>
+        <w:pStyle w:val="Normal"/>
+      </w:pPr>
+      <w:r>
+        <w:t xml:space="preserve"/>
+      </w:r>
+    </w:p>
+    <w:p>
+      <w:pPr>
+        <w:pStyle w:val="List Bullet"/>
+      </w:pPr>
+      <w:r>
+        <w:t xml:space="preserve">Estimated effort: 4-5 days</w:t>
+      </w:r>
+    </w:p>
+    <w:p>
+      <w:pPr>
+        <w:pStyle w:val="List Bullet"/>
+      </w:pPr>
+      <w:r>
+        <w:t xml:space="preserve">API: POST /api/git/commit, POST /api/git/push, GET /api/git/log</w:t>
+      </w:r>
+    </w:p>
+    <w:p>
+      <w:pPr>
+        <w:pStyle w:val="List Bullet"/>
+      </w:pPr>
+      <w:r>
+        <w:t xml:space="preserve">Settings field: GitHub token (stored in .env, never localStorage)</w:t>
+      </w:r>
+    </w:p>
+    <w:p>
+      <w:pPr>
+        <w:pStyle w:val="List Bullet"/>
+      </w:pPr>
+      <w:r>
+        <w:t xml:space="preserve">New frontend page: GitView.jsx</w:t>
+      </w:r>
+    </w:p>
+    <w:p>
+      <w:pPr>
+        <w:pStyle w:val="List Bullet"/>
+      </w:pPr>
+      <w:r>
+        <w:t xml:space="preserve">New backend module: git_agent.py (init, commit, push, PR via GitHub API)</w:t>
+      </w:r>
+    </w:p>
+    <w:p>
+      <w:pPr>
+        <w:pStyle w:val="List Bullet"/>
+      </w:pPr>
+      <w:r>
+        <w:t xml:space="preserve">pip: gitpython</w:t>
+      </w:r>
+    </w:p>
+    <w:p>
+      <w:pPr>
+        <w:pStyle w:val="Normal"/>
+      </w:pPr>
+      <w:r>
+        <w:rPr>
+          <w:b/>
+        </w:rPr>
+        <w:t xml:space="preserve">Technical requirements:</w:t>
+      </w:r>
+    </w:p>
+    <w:p>
+      <w:pPr>
+        <w:pStyle w:val="List Bullet"/>
+      </w:pPr>
+      <w:r>
+        <w:t xml:space="preserve">Orchestrator can create a branch per pipeline task and merge when complete</w:t>
+      </w:r>
+    </w:p>
+    <w:p>
+      <w:pPr>
+        <w:pStyle w:val="List Bullet"/>
+      </w:pPr>
+      <w:r>
+        <w:t xml:space="preserve">Add GitView.jsx: branch list, commit history, diff viewer</w:t>
+      </w:r>
+    </w:p>
+    <w:p>
+      <w:pPr>
+        <w:pStyle w:val="List Bullet"/>
+      </w:pPr>
+      <w:r>
+        <w:t xml:space="preserve">GitHub personal access token stored in Settings (server-side .env, never in browser)</w:t>
+      </w:r>
+    </w:p>
+    <w:p>
+      <w:pPr>
+        <w:pStyle w:val="List Bullet"/>
+      </w:pPr>
+      <w:r>
+        <w:t xml:space="preserve">Coder agent gets a Commit after saving toggle to auto-commit generated code</w:t>
+      </w:r>
+    </w:p>
+    <w:p>
+      <w:pPr>
+        <w:pStyle w:val="List Bullet"/>
+      </w:pPr>
+      <w:r>
+        <w:t xml:space="preserve">Add a Git panel in FilesView: staged files, commit message, push button</w:t>
+      </w:r>
+    </w:p>
+    <w:p>
+      <w:pPr>
+        <w:pStyle w:val="List Bullet"/>
+      </w:pPr>
+      <w:r>
+        <w:t xml:space="preserve">Initialise the workspace as a git repo on first run</w:t>
+      </w:r>
+    </w:p>
+    <w:p>
+      <w:pPr>
+        <w:pStyle w:val="Normal"/>
+      </w:pPr>
+      <w:r>
+        <w:rPr>
+          <w:b/>
+        </w:rPr>
+        <w:t xml:space="preserve">How to implement:</w:t>
+      </w:r>
+    </w:p>
+    <w:p>
+      <w:pPr>
+        <w:pStyle w:val="Normal"/>
+      </w:pPr>
+      <w:r>
+        <w:t xml:space="preserve">Why: Agents write code but users must manually copy and commit it. Git integration means the workspace is a real git repo. Agents commit, create branches, and open PRs without leaving the browser.</w:t>
+      </w:r>
+    </w:p>
+    <w:p>
+      <w:pPr>
+        <w:pStyle w:val="Normal"/>
+      </w:pPr>
+      <w:r>
+        <w:rPr>
+          <w:b/>
+        </w:rPr>
+        <w:t xml:space="preserve">Enhancement 3: Git / GitHub Integration</w:t>
+      </w:r>
+    </w:p>
+    <w:p>
+      <w:pPr>
+        <w:pStyle w:val="Normal"/>
+      </w:pPr>
+      <w:r>
+        <w:t xml:space="preserve"/>
+      </w:r>
+    </w:p>
+    <w:p>
+      <w:pPr>
+        <w:pStyle w:val="List Bullet"/>
+      </w:pPr>
+      <w:r>
+        <w:t xml:space="preserve">Estimated effort: 2-3 days</w:t>
+      </w:r>
+    </w:p>
+    <w:p>
+      <w:pPr>
+        <w:pStyle w:val="List Bullet"/>
+      </w:pPr>
+      <w:r>
+        <w:t xml:space="preserve">Route: if image_b64 present, use vision model; else use text model</w:t>
+      </w:r>
+    </w:p>
+    <w:p>
+      <w:pPr>
+        <w:pStyle w:val="List Bullet"/>
+      </w:pPr>
+      <w:r>
+        <w:t xml:space="preserve">Backend: update /api/chat to accept optional image_b64 field</w:t>
+      </w:r>
+    </w:p>
+    <w:p>
+      <w:pPr>
+        <w:pStyle w:val="List Bullet"/>
+      </w:pPr>
+      <w:r>
+        <w:t xml:space="preserve">Frontend: file input + clipboard paste handler in ChatView.jsx</w:t>
+      </w:r>
+    </w:p>
+    <w:p>
+      <w:pPr>
+        <w:pStyle w:val="List Bullet"/>
+      </w:pPr>
+      <w:r>
+        <w:t xml:space="preserve">Ollama vision model: llava:7b or moondream (both CPU-runnable)</w:t>
+      </w:r>
+    </w:p>
+    <w:p>
+      <w:pPr>
+        <w:pStyle w:val="Normal"/>
+      </w:pPr>
+      <w:r>
+        <w:rPr>
+          <w:b/>
+        </w:rPr>
+        <w:t xml:space="preserve">Technical requirements:</w:t>
+      </w:r>
+    </w:p>
+    <w:p>
+      <w:pPr>
+        <w:pStyle w:val="List Bullet"/>
+      </w:pPr>
+      <w:r>
+        <w:t xml:space="preserve">Add a Vision model selector in Settings (separate from the text model)</w:t>
+      </w:r>
+    </w:p>
+    <w:p>
+      <w:pPr>
+        <w:pStyle w:val="List Bullet"/>
+      </w:pPr>
+      <w:r>
+        <w:t xml:space="preserve">Researcher agent: paste a chart or document and it analyses and summarises</w:t>
+      </w:r>
+    </w:p>
+    <w:p>
+      <w:pPr>
+        <w:pStyle w:val="List Bullet"/>
+      </w:pPr>
+      <w:r>
+        <w:t xml:space="preserve">Coder agent: paste a UI screenshot and it writes the matching React/HTML code</w:t>
+      </w:r>
+    </w:p>
+    <w:p>
+      <w:pPr>
+        <w:pStyle w:val="List Bullet"/>
+      </w:pPr>
+      <w:r>
+        <w:t xml:space="preserve">Backend detects image presence and routes to a vision-capable Ollama model</w:t>
+      </w:r>
+    </w:p>
+    <w:p>
+      <w:pPr>
+        <w:pStyle w:val="List Bullet"/>
+      </w:pPr>
+      <w:r>
+        <w:t xml:space="preserve">Base64-encode the image and send it alongside the text message</w:t>
+      </w:r>
+    </w:p>
+    <w:p>
+      <w:pPr>
+        <w:pStyle w:val="List Bullet"/>
+      </w:pPr>
+      <w:r>
+        <w:t xml:space="preserve">Add image upload and clipboard paste support to ChatView</w:t>
+      </w:r>
+    </w:p>
+    <w:p>
+      <w:pPr>
+        <w:pStyle w:val="Normal"/>
+      </w:pPr>
+      <w:r>
+        <w:rPr>
+          <w:b/>
+        </w:rPr>
+        <w:t xml:space="preserve">How to implement:</w:t>
+      </w:r>
+    </w:p>
+    <w:p>
+      <w:pPr>
+        <w:pStyle w:val="Normal"/>
+      </w:pPr>
+      <w:r>
+        <w:t xml:space="preserve">Why: Text-only interaction limits KreativOS for UI design, image analysis, and screenshot debugging. Vision models via Ollama (LLaVA, Moondream) are free and CPU-runnable.</w:t>
+      </w:r>
+    </w:p>
+    <w:p>
+      <w:pPr>
+        <w:pStyle w:val="Normal"/>
+      </w:pPr>
+      <w:r>
+        <w:rPr>
+          <w:b/>
+        </w:rPr>
+        <w:t xml:space="preserve">Enhancement 2: Multi-modal Support (Image Input)</w:t>
+      </w:r>
+    </w:p>
+    <w:p>
+      <w:pPr>
+        <w:pStyle w:val="Normal"/>
+      </w:pPr>
+      <w:r>
+        <w:t xml:space="preserve"/>
+      </w:r>
+    </w:p>
+    <w:p>
+      <w:pPr>
+        <w:pStyle w:val="List Bullet"/>
+      </w:pPr>
+      <w:r>
+        <w:t xml:space="preserve">Estimated effort: 3-4 days</w:t>
+      </w:r>
+    </w:p>
+    <w:p>
+      <w:pPr>
+        <w:pStyle w:val="List Bullet"/>
+      </w:pPr>
+      <w:r>
+        <w:t xml:space="preserve">Storage: local ./knowledge_base/ directory</w:t>
+      </w:r>
+    </w:p>
+    <w:p>
+      <w:pPr>
+        <w:pStyle w:val="List Bullet"/>
+      </w:pPr>
+      <w:r>
+        <w:t xml:space="preserve">API: POST /api/kb/upload, GET /api/kb/search, DELETE /api/kb/doc/{id}</w:t>
+      </w:r>
+    </w:p>
+    <w:p>
+      <w:pPr>
+        <w:pStyle w:val="List Bullet"/>
+      </w:pPr>
+      <w:r>
+        <w:t xml:space="preserve">New frontend page: KnowledgeView.jsx</w:t>
+      </w:r>
+    </w:p>
+    <w:p>
+      <w:pPr>
+        <w:pStyle w:val="List Bullet"/>
+      </w:pPr>
+      <w:r>
+        <w:t xml:space="preserve">New backend module: rag.py (embed, store, retrieve)</w:t>
+      </w:r>
+    </w:p>
+    <w:p>
+      <w:pPr>
+        <w:pStyle w:val="List Bullet"/>
+      </w:pPr>
+      <w:r>
+        <w:t xml:space="preserve">pip: chromadb (or use Ollama embed endpoint directly)</w:t>
+      </w:r>
+    </w:p>
+    <w:p>
+      <w:pPr>
+        <w:pStyle w:val="Normal"/>
+      </w:pPr>
+      <w:r>
+        <w:rPr>
+          <w:b/>
+        </w:rPr>
+        <w:t xml:space="preserve">Technical requirements:</w:t>
+      </w:r>
+    </w:p>
+    <w:p>
+      <w:pPr>
+        <w:pStyle w:val="List Bullet"/>
+      </w:pPr>
+      <w:r>
+        <w:t xml:space="preserve">Add a toggle per-agent in Settings: Search knowledge base before responding</w:t>
+      </w:r>
+    </w:p>
+    <w:p>
+      <w:pPr>
+        <w:pStyle w:val="List Bullet"/>
+      </w:pPr>
+      <w:r>
+        <w:t xml:space="preserve">Add a Knowledge Base view in the sidebar to upload, browse, and delete documents</w:t>
+      </w:r>
+    </w:p>
+    <w:p>
+      <w:pPr>
+        <w:pStyle w:val="List Bullet"/>
+      </w:pPr>
+      <w:r>
+        <w:t xml:space="preserve">Before each agent response, retrieve the top-k relevant chunks and inject into context</w:t>
+      </w:r>
+    </w:p>
+    <w:p>
+      <w:pPr>
+        <w:pStyle w:val="List Bullet"/>
+      </w:pPr>
+      <w:r>
+        <w:t xml:space="preserve">When a user uploads a file or saves agent output, chunk it and store embeddings</w:t>
+      </w:r>
+    </w:p>
+    <w:p>
+      <w:pPr>
+        <w:pStyle w:val="List Bullet"/>
+      </w:pPr>
+      <w:r>
+        <w:t xml:space="preserve">Use ChromaDB locally as the vector store (no server needed, persists to ./knowledge_base/)</w:t>
+      </w:r>
+    </w:p>
+    <w:p>
+      <w:pPr>
+        <w:pStyle w:val="List Bullet"/>
+      </w:pPr>
+      <w:r>
+        <w:t xml:space="preserve">Add an embedding model via Ollama (nomic-embed-text, free, CPU-runnable)</w:t>
+      </w:r>
+    </w:p>
+    <w:p>
+      <w:pPr>
+        <w:pStyle w:val="Normal"/>
+      </w:pPr>
+      <w:r>
+        <w:rPr>
+          <w:b/>
+        </w:rPr>
+        <w:t xml:space="preserve">How to implement:</w:t>
+      </w:r>
+    </w:p>
+    <w:p>
+      <w:pPr>
+        <w:pStyle w:val="Normal"/>
+      </w:pPr>
+      <w:r>
+        <w:t xml:space="preserve">Why: Agents only have context from the current conversation. Long projects lose earlier decisions and research. RAG lets agents search a long-term knowledge base of documents and past work before every response.</w:t>
+      </w:r>
+    </w:p>
+    <w:p>
+      <w:pPr>
+        <w:pStyle w:val="Normal"/>
+      </w:pPr>
+      <w:r>
+        <w:rPr>
+          <w:b/>
+        </w:rPr>
+        <w:t xml:space="preserve">Enhancement 1: Persistent Vector Memory (RAG)</w:t>
+      </w:r>
+    </w:p>
+    <w:p>
+      <w:pPr>
+        <w:pStyle w:val="Normal"/>
+      </w:pPr>
+      <w:r>
+        <w:t xml:space="preserve"/>
+      </w:r>
+    </w:p>
+    <w:p>
+      <w:pPr>
+        <w:pStyle w:val="Normal"/>
+      </w:pPr>
+      <w:r>
+        <w:t xml:space="preserve">KreativOS v1.0 is feature-complete across all 10 original phases. The following enhancements define the next generation of capabilities, each with a clear rationale, implementation plan, and technical requirements.</w:t>
+      </w:r>
+    </w:p>
+    <w:p>
+      <w:pPr>
+        <w:pStyle w:val="Normal"/>
+      </w:pPr>
+      <w:r>
+        <w:rPr>
+          <w:b/>
+        </w:rPr>
+        <w:t xml:space="preserve">8. Future Enhancements</w:t>
+      </w:r>
     </w:p>
     <w:p>
       <w:pPr>
@@ -3218,7 +4613,7 @@
           <w:color w:val="A0A0B4"/>
           <w:sz w:val="18"/>
         </w:rPr>
-        <w:t>KreativOS v3.0  ·  Built with Claude  ·  26 June 2026</w:t>
+        <w:t>KreativOS v1.0  ·  Built with Claude  ·  26 June 2026</w:t>
       </w:r>
     </w:p>
     <w:sectPr>

</xml_diff>